<commit_message>
Expand SHM unit map with short presentation notes for each day and regenerate DOCX
</commit_message>
<xml_diff>
--- a/physics/Physics Unit Maps/09 SHM/UNIT_MAP.docx
+++ b/physics/Physics Unit Maps/09 SHM/UNIT_MAP.docx
@@ -73,13 +73,7 @@
         <w:t xml:space="preserve"> </w:t>
       </w:r>
       <w:r>
-        <w:t xml:space="preserve">- Edpuzzle: SHM Intro; SHM vs Circular Motion.</w:t>
-      </w:r>
-      <w:r>
-        <w:t xml:space="preserve"> </w:t>
-      </w:r>
-      <w:r>
-        <w:t xml:space="preserve">- Slides 1–29; WS9.1 Guided Notes (in-class).</w:t>
+        <w:t xml:space="preserve">- Quick demo/animation linking circular motion to SHM; slides 1–10 and WS9.1 guided notes (in-class paired work).</w:t>
       </w:r>
     </w:p>
     <w:p>
@@ -135,13 +129,7 @@
         <w:t xml:space="preserve"> </w:t>
       </w:r>
       <w:r>
-        <w:t xml:space="preserve">- Edpuzzle: Frequency vs Period.</w:t>
-      </w:r>
-      <w:r>
-        <w:t xml:space="preserve"> </w:t>
-      </w:r>
-      <w:r>
-        <w:t xml:space="preserve">- Practice problems and class discussion.</w:t>
+        <w:t xml:space="preserve">- Short Edpuzzle clip on frequency vs period; practice problems and rapid share-out; slide examples to calculate period/frequency.</w:t>
       </w:r>
     </w:p>
     <w:p>
@@ -197,13 +185,7 @@
         <w:t xml:space="preserve"> </w:t>
       </w:r>
       <w:r>
-        <w:t xml:space="preserve">- Edpuzzle: Horizontal vs Vertical Spring.</w:t>
-      </w:r>
-      <w:r>
-        <w:t xml:space="preserve"> </w:t>
-      </w:r>
-      <w:r>
-        <w:t xml:space="preserve">- Slides 30–47; begin WS9.2 in class.</w:t>
+        <w:t xml:space="preserve">- Mini-lesson on Hooke’s law and mass-spring setup; slides 30–47 and start WS9.2 in class with scaffolded examples.</w:t>
       </w:r>
     </w:p>
     <w:p>
@@ -259,13 +241,7 @@
         <w:t xml:space="preserve"> </w:t>
       </w:r>
       <w:r>
-        <w:t xml:space="preserve">- Edpuzzle: Force, Acceleration, Velocity.</w:t>
-      </w:r>
-      <w:r>
-        <w:t xml:space="preserve"> </w:t>
-      </w:r>
-      <w:r>
-        <w:t xml:space="preserve">- Finish WS9.2; emphasize key positions (A, 0, -A).</w:t>
+        <w:t xml:space="preserve">- Focused walkthrough of displacement/velocity/acceleration relations and key positions (A, 0, -A); complete WS9.2 in groups.</w:t>
       </w:r>
     </w:p>
     <w:p>
@@ -321,13 +297,7 @@
         <w:t xml:space="preserve"> </w:t>
       </w:r>
       <w:r>
-        <w:t xml:space="preserve">- 10–15 minute micro-quiz covering mass-spring concepts.</w:t>
-      </w:r>
-      <w:r>
-        <w:t xml:space="preserve"> </w:t>
-      </w:r>
-      <w:r>
-        <w:t xml:space="preserve">- Intro to energy in SHM.</w:t>
+        <w:t xml:space="preserve">- 10–15 minute micro-quiz; debrief and short intro to energy in SHM using one worked example.</w:t>
       </w:r>
     </w:p>
     <w:p>
@@ -383,13 +353,7 @@
         <w:t xml:space="preserve"> </w:t>
       </w:r>
       <w:r>
-        <w:t xml:space="preserve">- Edpuzzle: Energy Graphs.</w:t>
-      </w:r>
-      <w:r>
-        <w:t xml:space="preserve"> </w:t>
-      </w:r>
-      <w:r>
-        <w:t xml:space="preserve">- Teach energy equations; conceptual and calculation practice.</w:t>
+        <w:t xml:space="preserve">- Brief demo and slide derivation of kinetic and potential energy exchange; practice energy calculations with partner problems.</w:t>
       </w:r>
     </w:p>
     <w:p>
@@ -445,13 +409,7 @@
         <w:t xml:space="preserve"> </w:t>
       </w:r>
       <w:r>
-        <w:t xml:space="preserve">- Edpuzzle: SHM Graphs.</w:t>
-      </w:r>
-      <w:r>
-        <w:t xml:space="preserve"> </w:t>
-      </w:r>
-      <w:r>
-        <w:t xml:space="preserve">- Work on x, v, a graphs and their relationships.</w:t>
+        <w:t xml:space="preserve">- Graph sketching activity for x, v, a; quick peer checks on phase relationships and annotations.</w:t>
       </w:r>
     </w:p>
     <w:p>
@@ -507,13 +465,7 @@
         <w:t xml:space="preserve"> </w:t>
       </w:r>
       <w:r>
-        <w:t xml:space="preserve">- Edpuzzle: Pendulum SHM.</w:t>
-      </w:r>
-      <w:r>
-        <w:t xml:space="preserve"> </w:t>
-      </w:r>
-      <w:r>
-        <w:t xml:space="preserve">- Slides 93–113; compare systems and discuss period dependence.</w:t>
+        <w:t xml:space="preserve">- Compare pendulum to mass-spring (slides 93–113); short demo and problem solving on period dependence.</w:t>
       </w:r>
     </w:p>
     <w:p>
@@ -569,7 +521,7 @@
         <w:t xml:space="preserve"> </w:t>
       </w:r>
       <w:r>
-        <w:t xml:space="preserve">- Full practice test (MC + FR), immediate review and corrections.</w:t>
+        <w:t xml:space="preserve">- Full practice test (MC + FR); immediate review and correction session.</w:t>
       </w:r>
     </w:p>
     <w:p>

</xml_diff>